<commit_message>
Traduction du livret en anglais, ainsi que du matériel qui a changé
</commit_message>
<xml_diff>
--- a/pictures/Memos/memos-en.docx
+++ b/pictures/Memos/memos-en.docx
@@ -18,7 +18,7 @@
         <mc:AlternateContent>
           <mc:Choice Requires="wpc">
             <w:drawing>
-              <wp:inline distT="0" distB="0" distL="0" distR="0" wp14:anchorId="3F35520E" wp14:editId="57F4BE7E">
+              <wp:inline distT="0" distB="0" distL="0" distR="0" wp14:anchorId="3F35520E" wp14:editId="66A02717">
                 <wp:extent cx="10276840" cy="7200900"/>
                 <wp:effectExtent l="0" t="0" r="0" b="0"/>
                 <wp:docPr id="1879269446" name="Zone de dessin 1"/>
@@ -35,195 +35,207 @@
                         </a:blipFill>
                       </wpc:bg>
                       <wpc:whole/>
-                      <wps:wsp>
-                        <wps:cNvPr id="1903031763" name="Rectangle 1903031763"/>
-                        <wps:cNvSpPr/>
-                        <wps:spPr>
+                      <wpg:wgp>
+                        <wpg:cNvPr id="423655853" name="Groupe 423655853"/>
+                        <wpg:cNvGrpSpPr/>
+                        <wpg:grpSpPr>
                           <a:xfrm>
                             <a:off x="489692" y="314326"/>
                             <a:ext cx="3960390" cy="3121564"/>
+                            <a:chOff x="489692" y="314326"/>
+                            <a:chExt cx="3960390" cy="3121564"/>
                           </a:xfrm>
-                          <a:prstGeom prst="rect">
-                            <a:avLst/>
-                          </a:prstGeom>
-                          <a:noFill/>
-                          <a:ln>
-                            <a:solidFill>
-                              <a:schemeClr val="bg1"/>
-                            </a:solidFill>
-                          </a:ln>
-                        </wps:spPr>
-                        <wps:style>
-                          <a:lnRef idx="2">
-                            <a:schemeClr val="accent1">
-                              <a:shade val="15000"/>
-                            </a:schemeClr>
-                          </a:lnRef>
-                          <a:fillRef idx="1">
-                            <a:schemeClr val="accent1"/>
-                          </a:fillRef>
-                          <a:effectRef idx="0">
-                            <a:schemeClr val="accent1"/>
-                          </a:effectRef>
-                          <a:fontRef idx="minor">
-                            <a:schemeClr val="lt1"/>
-                          </a:fontRef>
-                        </wps:style>
-                        <wps:bodyPr rot="0" spcFirstLastPara="0" vert="horz" wrap="square" lIns="91440" tIns="45720" rIns="91440" bIns="45720" numCol="1" spcCol="0" rtlCol="0" fromWordArt="0" anchor="ctr" anchorCtr="0" forceAA="0" compatLnSpc="1">
-                          <a:prstTxWarp prst="textNoShape">
-                            <a:avLst/>
-                          </a:prstTxWarp>
-                          <a:noAutofit/>
-                        </wps:bodyPr>
-                      </wps:wsp>
-                      <pic:pic xmlns:pic="http://schemas.openxmlformats.org/drawingml/2006/picture">
-                        <pic:nvPicPr>
-                          <pic:cNvPr id="1455474112" name="Image 1455474112"/>
-                          <pic:cNvPicPr>
-                            <a:picLocks noChangeAspect="1"/>
-                          </pic:cNvPicPr>
-                        </pic:nvPicPr>
-                        <pic:blipFill>
-                          <a:blip r:embed="rId7" cstate="print">
-                            <a:lum bright="70000" contrast="-70000"/>
+                        </wpg:grpSpPr>
+                        <wps:wsp>
+                          <wps:cNvPr id="1903031763" name="Rectangle 1903031763"/>
+                          <wps:cNvSpPr/>
+                          <wps:spPr>
+                            <a:xfrm>
+                              <a:off x="489692" y="314326"/>
+                              <a:ext cx="3960390" cy="3121564"/>
+                            </a:xfrm>
+                            <a:prstGeom prst="rect">
+                              <a:avLst/>
+                            </a:prstGeom>
+                            <a:noFill/>
+                            <a:ln>
+                              <a:solidFill>
+                                <a:schemeClr val="bg1"/>
+                              </a:solidFill>
+                            </a:ln>
+                          </wps:spPr>
+                          <wps:style>
+                            <a:lnRef idx="2">
+                              <a:schemeClr val="accent1">
+                                <a:shade val="15000"/>
+                              </a:schemeClr>
+                            </a:lnRef>
+                            <a:fillRef idx="1">
+                              <a:schemeClr val="accent1"/>
+                            </a:fillRef>
+                            <a:effectRef idx="0">
+                              <a:schemeClr val="accent1"/>
+                            </a:effectRef>
+                            <a:fontRef idx="minor">
+                              <a:schemeClr val="lt1"/>
+                            </a:fontRef>
+                          </wps:style>
+                          <wps:bodyPr rot="0" spcFirstLastPara="0" vert="horz" wrap="square" lIns="91440" tIns="45720" rIns="91440" bIns="45720" numCol="1" spcCol="0" rtlCol="0" fromWordArt="0" anchor="ctr" anchorCtr="0" forceAA="0" compatLnSpc="1">
+                            <a:prstTxWarp prst="textNoShape">
+                              <a:avLst/>
+                            </a:prstTxWarp>
+                            <a:noAutofit/>
+                          </wps:bodyPr>
+                        </wps:wsp>
+                        <pic:pic xmlns:pic="http://schemas.openxmlformats.org/drawingml/2006/picture">
+                          <pic:nvPicPr>
+                            <pic:cNvPr id="1455474112" name="Image 1455474112"/>
+                            <pic:cNvPicPr>
+                              <a:picLocks noChangeAspect="1"/>
+                            </pic:cNvPicPr>
+                          </pic:nvPicPr>
+                          <pic:blipFill>
+                            <a:blip r:embed="rId7" cstate="print">
+                              <a:lum bright="70000" contrast="-70000"/>
+                              <a:extLst>
+                                <a:ext uri="{28A0092B-C50C-407E-A947-70E740481C1C}">
+                                  <a14:useLocalDpi xmlns:a14="http://schemas.microsoft.com/office/drawing/2010/main" val="0"/>
+                                </a:ext>
+                              </a:extLst>
+                            </a:blip>
+                            <a:srcRect/>
+                            <a:stretch>
+                              <a:fillRect/>
+                            </a:stretch>
+                          </pic:blipFill>
+                          <pic:spPr bwMode="auto">
+                            <a:xfrm>
+                              <a:off x="3587664" y="2493672"/>
+                              <a:ext cx="719992" cy="720000"/>
+                            </a:xfrm>
+                            <a:prstGeom prst="rect">
+                              <a:avLst/>
+                            </a:prstGeom>
+                            <a:noFill/>
+                            <a:ln>
+                              <a:noFill/>
+                            </a:ln>
+                          </pic:spPr>
+                        </pic:pic>
+                        <pic:pic xmlns:pic="http://schemas.openxmlformats.org/drawingml/2006/picture">
+                          <pic:nvPicPr>
+                            <pic:cNvPr id="976715722" name="Image 976715722"/>
+                            <pic:cNvPicPr>
+                              <a:picLocks noChangeAspect="1"/>
+                            </pic:cNvPicPr>
+                          </pic:nvPicPr>
+                          <pic:blipFill>
+                            <a:blip r:embed="rId8">
+                              <a:lum bright="70000" contrast="-70000"/>
+                              <a:extLst>
+                                <a:ext uri="{28A0092B-C50C-407E-A947-70E740481C1C}">
+                                  <a14:useLocalDpi xmlns:a14="http://schemas.microsoft.com/office/drawing/2010/main" val="0"/>
+                                </a:ext>
+                              </a:extLst>
+                            </a:blip>
+                            <a:srcRect/>
+                            <a:stretch>
+                              <a:fillRect/>
+                            </a:stretch>
+                          </pic:blipFill>
+                          <pic:spPr bwMode="auto">
+                            <a:xfrm flipH="1">
+                              <a:off x="681555" y="401744"/>
+                              <a:ext cx="719991" cy="720000"/>
+                            </a:xfrm>
+                            <a:prstGeom prst="rect">
+                              <a:avLst/>
+                            </a:prstGeom>
+                            <a:noFill/>
+                            <a:ln>
+                              <a:noFill/>
+                            </a:ln>
+                          </pic:spPr>
+                        </pic:pic>
+                        <pic:pic xmlns:pic="http://schemas.openxmlformats.org/drawingml/2006/picture">
+                          <pic:nvPicPr>
+                            <pic:cNvPr id="466307834" name="Image 466307834"/>
+                            <pic:cNvPicPr>
+                              <a:picLocks noChangeAspect="1"/>
+                            </pic:cNvPicPr>
+                          </pic:nvPicPr>
+                          <pic:blipFill rotWithShape="1">
+                            <a:blip r:embed="rId9">
+                              <a:extLst>
+                                <a:ext uri="{28A0092B-C50C-407E-A947-70E740481C1C}">
+                                  <a14:useLocalDpi xmlns:a14="http://schemas.microsoft.com/office/drawing/2010/main" val="0"/>
+                                </a:ext>
+                              </a:extLst>
+                            </a:blip>
+                            <a:srcRect l="32084" r="32145" b="13393"/>
+                            <a:stretch>
+                              <a:fillRect/>
+                            </a:stretch>
+                          </pic:blipFill>
+                          <pic:spPr bwMode="auto">
+                            <a:xfrm>
+                              <a:off x="642740" y="474804"/>
+                              <a:ext cx="3695700" cy="1847850"/>
+                            </a:xfrm>
+                            <a:prstGeom prst="rect">
+                              <a:avLst/>
+                            </a:prstGeom>
+                            <a:noFill/>
+                            <a:ln>
+                              <a:noFill/>
+                            </a:ln>
                             <a:extLst>
-                              <a:ext uri="{28A0092B-C50C-407E-A947-70E740481C1C}">
-                                <a14:useLocalDpi xmlns:a14="http://schemas.microsoft.com/office/drawing/2010/main" val="0"/>
+                              <a:ext uri="{53640926-AAD7-44D8-BBD7-CCE9431645EC}">
+                                <a14:shadowObscured xmlns:a14="http://schemas.microsoft.com/office/drawing/2010/main"/>
                               </a:ext>
                             </a:extLst>
-                          </a:blip>
-                          <a:srcRect/>
-                          <a:stretch>
-                            <a:fillRect/>
-                          </a:stretch>
-                        </pic:blipFill>
-                        <pic:spPr bwMode="auto">
-                          <a:xfrm>
-                            <a:off x="3436590" y="2493672"/>
-                            <a:ext cx="719992" cy="720000"/>
-                          </a:xfrm>
-                          <a:prstGeom prst="rect">
-                            <a:avLst/>
-                          </a:prstGeom>
-                          <a:noFill/>
-                          <a:ln>
+                          </pic:spPr>
+                        </pic:pic>
+                        <pic:pic xmlns:pic="http://schemas.openxmlformats.org/drawingml/2006/picture">
+                          <pic:nvPicPr>
+                            <pic:cNvPr id="644699675" name="Image 644699675"/>
+                            <pic:cNvPicPr>
+                              <a:picLocks noChangeAspect="1"/>
+                            </pic:cNvPicPr>
+                          </pic:nvPicPr>
+                          <pic:blipFill rotWithShape="1">
+                            <a:blip r:embed="rId10">
+                              <a:extLst>
+                                <a:ext uri="{28A0092B-C50C-407E-A947-70E740481C1C}">
+                                  <a14:useLocalDpi xmlns:a14="http://schemas.microsoft.com/office/drawing/2010/main" val="0"/>
+                                </a:ext>
+                              </a:extLst>
+                            </a:blip>
+                            <a:srcRect l="36257" r="36347" b="24920"/>
+                            <a:stretch>
+                              <a:fillRect/>
+                            </a:stretch>
+                          </pic:blipFill>
+                          <pic:spPr bwMode="auto">
+                            <a:xfrm>
+                              <a:off x="642740" y="2446122"/>
+                              <a:ext cx="2828290" cy="868045"/>
+                            </a:xfrm>
+                            <a:prstGeom prst="rect">
+                              <a:avLst/>
+                            </a:prstGeom>
                             <a:noFill/>
-                          </a:ln>
-                        </pic:spPr>
-                      </pic:pic>
-                      <pic:pic xmlns:pic="http://schemas.openxmlformats.org/drawingml/2006/picture">
-                        <pic:nvPicPr>
-                          <pic:cNvPr id="976715722" name="Image 976715722"/>
-                          <pic:cNvPicPr>
-                            <a:picLocks noChangeAspect="1"/>
-                          </pic:cNvPicPr>
-                        </pic:nvPicPr>
-                        <pic:blipFill>
-                          <a:blip r:embed="rId8">
-                            <a:lum bright="70000" contrast="-70000"/>
+                            <a:ln>
+                              <a:noFill/>
+                            </a:ln>
                             <a:extLst>
-                              <a:ext uri="{28A0092B-C50C-407E-A947-70E740481C1C}">
-                                <a14:useLocalDpi xmlns:a14="http://schemas.microsoft.com/office/drawing/2010/main" val="0"/>
+                              <a:ext uri="{53640926-AAD7-44D8-BBD7-CCE9431645EC}">
+                                <a14:shadowObscured xmlns:a14="http://schemas.microsoft.com/office/drawing/2010/main"/>
                               </a:ext>
                             </a:extLst>
-                          </a:blip>
-                          <a:srcRect/>
-                          <a:stretch>
-                            <a:fillRect/>
-                          </a:stretch>
-                        </pic:blipFill>
-                        <pic:spPr bwMode="auto">
-                          <a:xfrm flipH="1">
-                            <a:off x="681555" y="401744"/>
-                            <a:ext cx="719991" cy="720000"/>
-                          </a:xfrm>
-                          <a:prstGeom prst="rect">
-                            <a:avLst/>
-                          </a:prstGeom>
-                          <a:noFill/>
-                          <a:ln>
-                            <a:noFill/>
-                          </a:ln>
-                        </pic:spPr>
-                      </pic:pic>
-                      <pic:pic xmlns:pic="http://schemas.openxmlformats.org/drawingml/2006/picture">
-                        <pic:nvPicPr>
-                          <pic:cNvPr id="466307834" name="Image 466307834"/>
-                          <pic:cNvPicPr>
-                            <a:picLocks noChangeAspect="1"/>
-                          </pic:cNvPicPr>
-                        </pic:nvPicPr>
-                        <pic:blipFill rotWithShape="1">
-                          <a:blip r:embed="rId9">
-                            <a:extLst>
-                              <a:ext uri="{28A0092B-C50C-407E-A947-70E740481C1C}">
-                                <a14:useLocalDpi xmlns:a14="http://schemas.microsoft.com/office/drawing/2010/main" val="0"/>
-                              </a:ext>
-                            </a:extLst>
-                          </a:blip>
-                          <a:srcRect l="32084" r="32145" b="13393"/>
-                          <a:stretch>
-                            <a:fillRect/>
-                          </a:stretch>
-                        </pic:blipFill>
-                        <pic:spPr bwMode="auto">
-                          <a:xfrm>
-                            <a:off x="642740" y="474804"/>
-                            <a:ext cx="3695700" cy="1847850"/>
-                          </a:xfrm>
-                          <a:prstGeom prst="rect">
-                            <a:avLst/>
-                          </a:prstGeom>
-                          <a:noFill/>
-                          <a:ln>
-                            <a:noFill/>
-                          </a:ln>
-                          <a:extLst>
-                            <a:ext uri="{53640926-AAD7-44D8-BBD7-CCE9431645EC}">
-                              <a14:shadowObscured xmlns:a14="http://schemas.microsoft.com/office/drawing/2010/main"/>
-                            </a:ext>
-                          </a:extLst>
-                        </pic:spPr>
-                      </pic:pic>
-                      <pic:pic xmlns:pic="http://schemas.openxmlformats.org/drawingml/2006/picture">
-                        <pic:nvPicPr>
-                          <pic:cNvPr id="657192978" name="Image 657192978"/>
-                          <pic:cNvPicPr>
-                            <a:picLocks noChangeAspect="1"/>
-                          </pic:cNvPicPr>
-                        </pic:nvPicPr>
-                        <pic:blipFill rotWithShape="1">
-                          <a:blip r:embed="rId10">
-                            <a:extLst>
-                              <a:ext uri="{28A0092B-C50C-407E-A947-70E740481C1C}">
-                                <a14:useLocalDpi xmlns:a14="http://schemas.microsoft.com/office/drawing/2010/main" val="0"/>
-                              </a:ext>
-                            </a:extLst>
-                          </a:blip>
-                          <a:srcRect l="37488" r="37446" b="24600"/>
-                          <a:stretch>
-                            <a:fillRect/>
-                          </a:stretch>
-                        </pic:blipFill>
-                        <pic:spPr bwMode="auto">
-                          <a:xfrm>
-                            <a:off x="643137" y="2424435"/>
-                            <a:ext cx="2588260" cy="871855"/>
-                          </a:xfrm>
-                          <a:prstGeom prst="rect">
-                            <a:avLst/>
-                          </a:prstGeom>
-                          <a:noFill/>
-                          <a:ln>
-                            <a:noFill/>
-                          </a:ln>
-                          <a:extLst>
-                            <a:ext uri="{53640926-AAD7-44D8-BBD7-CCE9431645EC}">
-                              <a14:shadowObscured xmlns:a14="http://schemas.microsoft.com/office/drawing/2010/main"/>
-                            </a:ext>
-                          </a:extLst>
-                        </pic:spPr>
-                      </pic:pic>
+                          </pic:spPr>
+                        </pic:pic>
+                      </wpg:wgp>
                     </wpc:wpc>
                   </a:graphicData>
                 </a:graphic>
@@ -232,7 +244,7 @@
           </mc:Choice>
           <mc:Fallback>
             <w:pict>
-              <v:group w14:anchorId="5F6DFA62" id="Zone de dessin 1" o:spid="_x0000_s1026" editas="canvas" style="width:809.2pt;height:567pt;mso-position-horizontal-relative:char;mso-position-vertical-relative:line" coordsize="102768,72009" o:gfxdata="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">
+              <v:group w14:anchorId="5F774F1D" id="Zone de dessin 1" o:spid="_x0000_s1026" editas="canvas" style="width:809.2pt;height:567pt;mso-position-horizontal-relative:char;mso-position-vertical-relative:line" coordsize="102768,72009" o:gfxdata="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">
                 <v:shapetype id="_x0000_t75" coordsize="21600,21600" o:spt="75" o:preferrelative="t" path="m@4@5l@4@11@9@11@9@5xe" filled="f" stroked="f">
                   <v:stroke joinstyle="miter"/>
                   <v:formulas>
@@ -256,19 +268,21 @@
                   <v:fill r:id="rId11" o:title="" recolor="t" rotate="t" o:detectmouseclick="t" type="tile"/>
                   <v:path o:connecttype="none"/>
                 </v:shape>
-                <v:rect id="Rectangle 1903031763" o:spid="_x0000_s1028" style="position:absolute;left:4896;top:3143;width:39604;height:31215;visibility:visible;mso-wrap-style:square;v-text-anchor:middle" o:gfxdata="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" filled="f" strokecolor="white [3212]" strokeweight="1pt"/>
-                <v:shape id="Image 1455474112" o:spid="_x0000_s1029" type="#_x0000_t75" style="position:absolute;left:34365;top:24936;width:7200;height:7200;visibility:visible;mso-wrap-style:square" o:gfxdata="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">
-                  <v:imagedata r:id="rId12" o:title="" gain="19661f" blacklevel="22938f"/>
-                </v:shape>
-                <v:shape id="Image 976715722" o:spid="_x0000_s1030" type="#_x0000_t75" style="position:absolute;left:6815;top:4017;width:7200;height:7200;flip:x;visibility:visible;mso-wrap-style:square" o:gfxdata="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">
-                  <v:imagedata r:id="rId13" o:title="" gain="19661f" blacklevel="22938f"/>
-                </v:shape>
-                <v:shape id="Image 466307834" o:spid="_x0000_s1031" type="#_x0000_t75" style="position:absolute;left:6427;top:4748;width:36957;height:18478;visibility:visible;mso-wrap-style:square" o:gfxdata="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">
-                  <v:imagedata r:id="rId14" o:title="" cropbottom="8777f" cropleft="21027f" cropright="21067f"/>
-                </v:shape>
-                <v:shape id="Image 657192978" o:spid="_x0000_s1032" type="#_x0000_t75" style="position:absolute;left:6431;top:24244;width:25882;height:8718;visibility:visible;mso-wrap-style:square" o:gfxdata="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">
-                  <v:imagedata r:id="rId15" o:title="" cropbottom="16122f" cropleft="24568f" cropright="24541f"/>
-                </v:shape>
+                <v:group id="Groupe 423655853" o:spid="_x0000_s1028" style="position:absolute;left:4896;top:3143;width:39604;height:31215" coordorigin="4896,3143" coordsize="39603,31215" o:gfxdata="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">
+                  <v:rect id="Rectangle 1903031763" o:spid="_x0000_s1029" style="position:absolute;left:4896;top:3143;width:39604;height:31215;visibility:visible;mso-wrap-style:square;v-text-anchor:middle" o:gfxdata="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" filled="f" strokecolor="white [3212]" strokeweight="1pt"/>
+                  <v:shape id="Image 1455474112" o:spid="_x0000_s1030" type="#_x0000_t75" style="position:absolute;left:35876;top:24936;width:7200;height:7200;visibility:visible;mso-wrap-style:square" o:gfxdata="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">
+                    <v:imagedata r:id="rId12" o:title="" gain="19661f" blacklevel="22938f"/>
+                  </v:shape>
+                  <v:shape id="Image 976715722" o:spid="_x0000_s1031" type="#_x0000_t75" style="position:absolute;left:6815;top:4017;width:7200;height:7200;flip:x;visibility:visible;mso-wrap-style:square" o:gfxdata="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">
+                    <v:imagedata r:id="rId13" o:title="" gain="19661f" blacklevel="22938f"/>
+                  </v:shape>
+                  <v:shape id="Image 466307834" o:spid="_x0000_s1032" type="#_x0000_t75" style="position:absolute;left:6427;top:4748;width:36957;height:18478;visibility:visible;mso-wrap-style:square" o:gfxdata="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">
+                    <v:imagedata r:id="rId14" o:title="" cropbottom="8777f" cropleft="21027f" cropright="21067f"/>
+                  </v:shape>
+                  <v:shape id="Image 644699675" o:spid="_x0000_s1033" type="#_x0000_t75" style="position:absolute;left:6427;top:24461;width:28283;height:8680;visibility:visible;mso-wrap-style:square" o:gfxdata="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">
+                    <v:imagedata r:id="rId15" o:title="" cropbottom="16332f" cropleft="23761f" cropright="23820f"/>
+                  </v:shape>
+                </v:group>
                 <w10:anchorlock/>
               </v:group>
             </w:pict>
@@ -2649,10 +2663,10 @@
       <w:tblGrid>
         <w:gridCol w:w="338"/>
         <w:gridCol w:w="1129"/>
-        <w:gridCol w:w="742"/>
+        <w:gridCol w:w="773"/>
         <w:gridCol w:w="285"/>
-        <w:gridCol w:w="790"/>
-        <w:gridCol w:w="742"/>
+        <w:gridCol w:w="1154"/>
+        <w:gridCol w:w="773"/>
       </w:tblGrid>
       <w:tr>
         <w:trPr>
@@ -2806,7 +2820,7 @@
                 <w:szCs w:val="16"/>
                 <w:lang w:val="en-US"/>
               </w:rPr>
-              <w:t>Cemetery</w:t>
+              <w:t>Administration</w:t>
             </w:r>
           </w:p>
         </w:tc>
@@ -2960,7 +2974,18 @@
                 <w:szCs w:val="16"/>
                 <w:lang w:val="en-US"/>
               </w:rPr>
-              <w:t>troops</w:t>
+              <w:t>T</w:t>
+            </w:r>
+            <w:r>
+              <w:rPr>
+                <w:rFonts w:ascii="Segoe UI" w:hAnsi="Segoe UI" w:cs="Segoe UI"/>
+                <w:b/>
+                <w:bCs/>
+                <w:sz w:val="16"/>
+                <w:szCs w:val="16"/>
+                <w:lang w:val="en-US"/>
+              </w:rPr>
+              <w:t>roops</w:t>
             </w:r>
           </w:p>
         </w:tc>
@@ -3039,7 +3064,18 @@
                 <w:szCs w:val="16"/>
                 <w:lang w:val="en-US"/>
               </w:rPr>
-              <w:t>troops</w:t>
+              <w:t>T</w:t>
+            </w:r>
+            <w:r>
+              <w:rPr>
+                <w:rFonts w:ascii="Segoe UI" w:hAnsi="Segoe UI" w:cs="Segoe UI"/>
+                <w:b/>
+                <w:bCs/>
+                <w:sz w:val="16"/>
+                <w:szCs w:val="16"/>
+                <w:lang w:val="en-US"/>
+              </w:rPr>
+              <w:t>roops</w:t>
             </w:r>
           </w:p>
         </w:tc>
@@ -3197,7 +3233,18 @@
                 <w:szCs w:val="16"/>
                 <w:lang w:val="en-US"/>
               </w:rPr>
-              <w:t>troops</w:t>
+              <w:t>T</w:t>
+            </w:r>
+            <w:r>
+              <w:rPr>
+                <w:rFonts w:ascii="Segoe UI" w:hAnsi="Segoe UI" w:cs="Segoe UI"/>
+                <w:b/>
+                <w:bCs/>
+                <w:sz w:val="16"/>
+                <w:szCs w:val="16"/>
+                <w:lang w:val="en-US"/>
+              </w:rPr>
+              <w:t>roops</w:t>
             </w:r>
           </w:p>
         </w:tc>
@@ -3323,7 +3370,18 @@
                 <w:szCs w:val="16"/>
                 <w:lang w:val="en-US"/>
               </w:rPr>
-              <w:t>troops</w:t>
+              <w:t>T</w:t>
+            </w:r>
+            <w:r>
+              <w:rPr>
+                <w:rFonts w:ascii="Segoe UI" w:hAnsi="Segoe UI" w:cs="Segoe UI"/>
+                <w:b/>
+                <w:bCs/>
+                <w:sz w:val="16"/>
+                <w:szCs w:val="16"/>
+                <w:lang w:val="en-US"/>
+              </w:rPr>
+              <w:t>roops</w:t>
             </w:r>
           </w:p>
         </w:tc>
@@ -3444,7 +3502,18 @@
                 <w:szCs w:val="16"/>
                 <w:lang w:val="en-US"/>
               </w:rPr>
-              <w:t>troops</w:t>
+              <w:t>T</w:t>
+            </w:r>
+            <w:r>
+              <w:rPr>
+                <w:rFonts w:ascii="Segoe UI" w:hAnsi="Segoe UI" w:cs="Segoe UI"/>
+                <w:b/>
+                <w:bCs/>
+                <w:sz w:val="16"/>
+                <w:szCs w:val="16"/>
+                <w:lang w:val="en-US"/>
+              </w:rPr>
+              <w:t>roops</w:t>
             </w:r>
           </w:p>
         </w:tc>
@@ -3517,7 +3586,18 @@
                 <w:szCs w:val="16"/>
                 <w:lang w:val="en-US"/>
               </w:rPr>
-              <w:t>troops</w:t>
+              <w:t>T</w:t>
+            </w:r>
+            <w:r>
+              <w:rPr>
+                <w:rFonts w:ascii="Segoe UI" w:hAnsi="Segoe UI" w:cs="Segoe UI"/>
+                <w:b/>
+                <w:bCs/>
+                <w:sz w:val="16"/>
+                <w:szCs w:val="16"/>
+                <w:lang w:val="en-US"/>
+              </w:rPr>
+              <w:t>roops</w:t>
             </w:r>
           </w:p>
         </w:tc>
@@ -3558,7 +3638,18 @@
                 <w:szCs w:val="16"/>
                 <w:lang w:val="en-US"/>
               </w:rPr>
-              <w:t>troops</w:t>
+              <w:t>T</w:t>
+            </w:r>
+            <w:r>
+              <w:rPr>
+                <w:rFonts w:ascii="Segoe UI" w:hAnsi="Segoe UI" w:cs="Segoe UI"/>
+                <w:b/>
+                <w:bCs/>
+                <w:sz w:val="16"/>
+                <w:szCs w:val="16"/>
+                <w:lang w:val="en-US"/>
+              </w:rPr>
+              <w:t>roops</w:t>
             </w:r>
           </w:p>
         </w:tc>

</xml_diff>